<commit_message>
docs: registra processo de implementacao das 4 arquiteturas no docx
</commit_message>
<xml_diff>
--- a/Diagramas de Arquitetura - Atividade 01 P2P.docx
+++ b/Diagramas de Arquitetura - Atividade 01 P2P.docx
@@ -464,6 +464,149 @@
         <w:t>agregar.ts: lê o CSV, agrupa por arquitetura+tamanhoMB, calcula min/média/máx com reduce puro (sem lib), imprime tabela no console.</w:t>
       </w:r>
     </w:p>
+    <w:p>
+      <w:r>
+        <w:br w:type="page"/>
+      </w:r>
+    </w:p>
+    <w:p>
+      <w:pPr>
+        <w:pStyle w:val="Title"/>
+      </w:pPr>
+      <w:r>
+        <w:t>Registro do Processo de Implementação</w:t>
+      </w:r>
+    </w:p>
+    <w:p>
+      <w:r>
+        <w:t>Ordem real de desenvolvimento, com as decisões técnicas tomadas a partir de testes práticos (não suposições). Cada módulo foi escrito, compilado (tsc --noEmit) e testado de ponta a ponta antes de seguir para o próximo.</w:t>
+      </w:r>
+    </w:p>
+    <w:p>
+      <w:pPr>
+        <w:pStyle w:val="Heading1"/>
+      </w:pPr>
+      <w:r>
+        <w:t>1. Módulos comuns</w:t>
+      </w:r>
+    </w:p>
+    <w:p>
+      <w:pPr>
+        <w:pStyle w:val="ListBullet"/>
+      </w:pPr>
+      <w:r>
+        <w:t>gerarArquivo.ts (buffer aleatório em memória via crypto.randomBytes) e csv.ts (append de resultado) implementados e testados primeiro, por serem usados por todas as arquiteturas.</w:t>
+      </w:r>
+    </w:p>
+    <w:p>
+      <w:pPr>
+        <w:pStyle w:val="Heading1"/>
+      </w:pPr>
+      <w:r>
+        <w:t>2. Arquitetura Serial</w:t>
+      </w:r>
+    </w:p>
+    <w:p>
+      <w:pPr>
+        <w:pStyle w:val="ListBullet"/>
+      </w:pPr>
+      <w:r>
+        <w:t>Primeira versão usou servidor.maxConnections = 1. Teste prático revelou que essa opção RECUSA a conexão excedente (destroy imediato, sem erro explícito) em vez de enfileirar — o cliente 2 seria desconectado sem receber dado, incompatível com medir "tempo até o fim do download". Confirmado via teste isolado com net.createConnection antes de decidir.</w:t>
+      </w:r>
+    </w:p>
+    <w:p>
+      <w:pPr>
+        <w:pStyle w:val="ListBullet"/>
+      </w:pPr>
+      <w:r>
+        <w:t>Solução adotada: fila manual (array de sockets) com flag ocupado. socket.end(buffer, callback) — o callback só dispara quando o envio termina de fato, garantindo atendimento verdadeiramente serial. Testado com 2 clientes reais: segundo cliente só recebeu dado após o primeiro terminar.</w:t>
+      </w:r>
+    </w:p>
+    <w:p>
+      <w:pPr>
+        <w:pStyle w:val="Heading1"/>
+      </w:pPr>
+      <w:r>
+        <w:t>3. Arquitetura Concorrente</w:t>
+      </w:r>
+    </w:p>
+    <w:p>
+      <w:pPr>
+        <w:pStyle w:val="ListBullet"/>
+      </w:pPr>
+      <w:r>
+        <w:t>Mesma base do serial, sem fila e sem limite — o event loop do Node já atende todas as conexões em paralelo nativamente. Testado com 2 clientes: ambos terminaram quase juntos (tempos próximos), confirmando paralelismo real (diferente do serial).</w:t>
+      </w:r>
+    </w:p>
+    <w:p>
+      <w:pPr>
+        <w:pStyle w:val="Heading1"/>
+      </w:pPr>
+      <w:r>
+        <w:t>4. Arquitetura Pool (N)</w:t>
+      </w:r>
+    </w:p>
+    <w:p>
+      <w:pPr>
+        <w:pStyle w:val="ListBullet"/>
+      </w:pPr>
+      <w:r>
+        <w:t>Combina fila (serial) com paralelismo limitado (concorrente): contador de conexões ativas (semáforo simples) em vez de flag booleana. Com N = 2, testado com 3 clientes simultâneos (teste dedicado com delay artificial no servidor): os 2 primeiros foram atendidos em paralelo, o 3º esperou uma vaga liberar antes de começar — comportamento de pool confirmado na prática, não apenas por leitura do código.</w:t>
+      </w:r>
+    </w:p>
+    <w:p>
+      <w:pPr>
+        <w:pStyle w:val="Heading1"/>
+      </w:pPr>
+      <w:r>
+        <w:t>5. Arquitetura P2P</w:t>
+      </w:r>
+    </w:p>
+    <w:p>
+      <w:pPr>
+        <w:pStyle w:val="ListBullet"/>
+      </w:pPr>
+      <w:r>
+        <w:t>Antes de escrever código, a API real da lib webtorrent foi inspecionada (README, index.d.ts de @types/webtorrent, código-fonte de index.js) em vez de assumida. Descoberta de um problema de compatibilidade real: webtorrent 3.x é um pacote ESM puro ("type": "module"), enquanto o projeto é CommonJS — import direto falhava com ERR_PACKAGE_PATH_NOT_EXPORTED ao rodar via tsx.</w:t>
+      </w:r>
+    </w:p>
+    <w:p>
+      <w:pPr>
+        <w:pStyle w:val="ListBullet"/>
+      </w:pPr>
+      <w:r>
+        <w:t>Solução adotada: dynamic import (await import("webtorrent")) isolado dentro das funções async de seed.ts e peer.ts, em vez de migrar o projeto inteiro para ESM. Resolve a incompatibilidade sem afetar os módulos common/serial/concorrente/pool, que continuam em CommonJS com require(). Confirmado com teste exploratório (seed + 2 peers locais) antes de integrar à medição de tempo e ao CSV.</w:t>
+      </w:r>
+    </w:p>
+    <w:p>
+      <w:pPr>
+        <w:pStyle w:val="Heading1"/>
+      </w:pPr>
+      <w:r>
+        <w:t>6. Script de Agregação</w:t>
+      </w:r>
+    </w:p>
+    <w:p>
+      <w:pPr>
+        <w:pStyle w:val="ListBullet"/>
+      </w:pPr>
+      <w:r>
+        <w:t>agregar.ts testado com CSV sintético de valores conhecidos (ex.: 100 e 200 → média esperada 150) antes de ser usado nos dados reais dos experimentos, confirmando o agrupamento por arquitetura+tamanho e o cálculo de min/média/máx.</w:t>
+      </w:r>
+    </w:p>
+    <w:p>
+      <w:pPr>
+        <w:pStyle w:val="Heading1"/>
+      </w:pPr>
+      <w:r>
+        <w:t>Controle de versão</w:t>
+      </w:r>
+    </w:p>
+    <w:p>
+      <w:r>
+        <w:t>Projeto versionado em Git com commits separados por módulo/decisão (setup, cada arquitetura, dependência webtorrent, script de agregação), preservando o histórico do processo de construção.</w:t>
+      </w:r>
+    </w:p>
     <w:sectPr>
       <w:pgSz w:w="12240" w:h="15840"/>
       <w:pgMar w:top="1440" w:right="1800" w:bottom="1440" w:left="1800" w:header="720" w:footer="720" w:gutter="0"/>

</xml_diff>

<commit_message>
docs: registra resultados dos experimentos no docx (tabela + observacoes)
</commit_message>
<xml_diff>
--- a/Diagramas de Arquitetura - Atividade 01 P2P.docx
+++ b/Diagramas de Arquitetura - Atividade 01 P2P.docx
@@ -607,6 +607,760 @@
         <w:t>Projeto versionado em Git com commits separados por módulo/decisão (setup, cada arquitetura, dependência webtorrent, script de agregação), preservando o histórico do processo de construção.</w:t>
       </w:r>
     </w:p>
+    <w:p>
+      <w:r>
+        <w:br w:type="page"/>
+      </w:r>
+    </w:p>
+    <w:p>
+      <w:pPr>
+        <w:pStyle w:val="Title"/>
+      </w:pPr>
+      <w:r>
+        <w:t>Resultados dos Experimentos</w:t>
+      </w:r>
+    </w:p>
+    <w:p>
+      <w:r>
+        <w:t>Execução real das 4 arquiteturas, 3 tamanhos de arquivo (5, 50, 500 MB), 2 clientes por experimento, em localhost. Tempo medido no cliente: do connect/add até o fim do download. Valores em milissegundos (ms).</w:t>
+      </w:r>
+    </w:p>
+    <w:tbl>
+      <w:tblPr>
+        <w:tblStyle w:val="LightGrid-Accent1"/>
+        <w:tblW w:type="auto" w:w="0"/>
+        <w:tblLook w:firstColumn="1" w:firstRow="1" w:lastColumn="0" w:lastRow="0" w:noHBand="0" w:noVBand="1" w:val="04A0"/>
+      </w:tblPr>
+      <w:tblGrid>
+        <w:gridCol w:w="1728"/>
+        <w:gridCol w:w="1728"/>
+        <w:gridCol w:w="1728"/>
+        <w:gridCol w:w="1728"/>
+        <w:gridCol w:w="1728"/>
+      </w:tblGrid>
+      <w:tr>
+        <w:tc>
+          <w:tcPr>
+            <w:tcW w:type="dxa" w:w="1728"/>
+          </w:tcPr>
+          <w:p>
+            <w:r>
+              <w:t>Arquitetura</w:t>
+            </w:r>
+          </w:p>
+        </w:tc>
+        <w:tc>
+          <w:tcPr>
+            <w:tcW w:type="dxa" w:w="1728"/>
+          </w:tcPr>
+          <w:p>
+            <w:r>
+              <w:t>Tamanho (MB)</w:t>
+            </w:r>
+          </w:p>
+        </w:tc>
+        <w:tc>
+          <w:tcPr>
+            <w:tcW w:type="dxa" w:w="1728"/>
+          </w:tcPr>
+          <w:p>
+            <w:r>
+              <w:t>Min (ms)</w:t>
+            </w:r>
+          </w:p>
+        </w:tc>
+        <w:tc>
+          <w:tcPr>
+            <w:tcW w:type="dxa" w:w="1728"/>
+          </w:tcPr>
+          <w:p>
+            <w:r>
+              <w:t>Média (ms)</w:t>
+            </w:r>
+          </w:p>
+        </w:tc>
+        <w:tc>
+          <w:tcPr>
+            <w:tcW w:type="dxa" w:w="1728"/>
+          </w:tcPr>
+          <w:p>
+            <w:r>
+              <w:t>Máx (ms)</w:t>
+            </w:r>
+          </w:p>
+        </w:tc>
+      </w:tr>
+      <w:tr>
+        <w:tc>
+          <w:tcPr>
+            <w:tcW w:type="dxa" w:w="1728"/>
+          </w:tcPr>
+          <w:p>
+            <w:r>
+              <w:t>serial</w:t>
+            </w:r>
+          </w:p>
+        </w:tc>
+        <w:tc>
+          <w:tcPr>
+            <w:tcW w:type="dxa" w:w="1728"/>
+          </w:tcPr>
+          <w:p>
+            <w:r>
+              <w:t>5</w:t>
+            </w:r>
+          </w:p>
+        </w:tc>
+        <w:tc>
+          <w:tcPr>
+            <w:tcW w:type="dxa" w:w="1728"/>
+          </w:tcPr>
+          <w:p>
+            <w:r>
+              <w:t>25</w:t>
+            </w:r>
+          </w:p>
+        </w:tc>
+        <w:tc>
+          <w:tcPr>
+            <w:tcW w:type="dxa" w:w="1728"/>
+          </w:tcPr>
+          <w:p>
+            <w:r>
+              <w:t>29.5</w:t>
+            </w:r>
+          </w:p>
+        </w:tc>
+        <w:tc>
+          <w:tcPr>
+            <w:tcW w:type="dxa" w:w="1728"/>
+          </w:tcPr>
+          <w:p>
+            <w:r>
+              <w:t>34</w:t>
+            </w:r>
+          </w:p>
+        </w:tc>
+      </w:tr>
+      <w:tr>
+        <w:tc>
+          <w:tcPr>
+            <w:tcW w:type="dxa" w:w="1728"/>
+          </w:tcPr>
+          <w:p>
+            <w:r>
+              <w:t>serial</w:t>
+            </w:r>
+          </w:p>
+        </w:tc>
+        <w:tc>
+          <w:tcPr>
+            <w:tcW w:type="dxa" w:w="1728"/>
+          </w:tcPr>
+          <w:p>
+            <w:r>
+              <w:t>50</w:t>
+            </w:r>
+          </w:p>
+        </w:tc>
+        <w:tc>
+          <w:tcPr>
+            <w:tcW w:type="dxa" w:w="1728"/>
+          </w:tcPr>
+          <w:p>
+            <w:r>
+              <w:t>320</w:t>
+            </w:r>
+          </w:p>
+        </w:tc>
+        <w:tc>
+          <w:tcPr>
+            <w:tcW w:type="dxa" w:w="1728"/>
+          </w:tcPr>
+          <w:p>
+            <w:r>
+              <w:t>346.0</w:t>
+            </w:r>
+          </w:p>
+        </w:tc>
+        <w:tc>
+          <w:tcPr>
+            <w:tcW w:type="dxa" w:w="1728"/>
+          </w:tcPr>
+          <w:p>
+            <w:r>
+              <w:t>372</w:t>
+            </w:r>
+          </w:p>
+        </w:tc>
+      </w:tr>
+      <w:tr>
+        <w:tc>
+          <w:tcPr>
+            <w:tcW w:type="dxa" w:w="1728"/>
+          </w:tcPr>
+          <w:p>
+            <w:r>
+              <w:t>serial</w:t>
+            </w:r>
+          </w:p>
+        </w:tc>
+        <w:tc>
+          <w:tcPr>
+            <w:tcW w:type="dxa" w:w="1728"/>
+          </w:tcPr>
+          <w:p>
+            <w:r>
+              <w:t>500</w:t>
+            </w:r>
+          </w:p>
+        </w:tc>
+        <w:tc>
+          <w:tcPr>
+            <w:tcW w:type="dxa" w:w="1728"/>
+          </w:tcPr>
+          <w:p>
+            <w:r>
+              <w:t>1919</w:t>
+            </w:r>
+          </w:p>
+        </w:tc>
+        <w:tc>
+          <w:tcPr>
+            <w:tcW w:type="dxa" w:w="1728"/>
+          </w:tcPr>
+          <w:p>
+            <w:r>
+              <w:t>2078.0</w:t>
+            </w:r>
+          </w:p>
+        </w:tc>
+        <w:tc>
+          <w:tcPr>
+            <w:tcW w:type="dxa" w:w="1728"/>
+          </w:tcPr>
+          <w:p>
+            <w:r>
+              <w:t>2237</w:t>
+            </w:r>
+          </w:p>
+        </w:tc>
+      </w:tr>
+      <w:tr>
+        <w:tc>
+          <w:tcPr>
+            <w:tcW w:type="dxa" w:w="1728"/>
+          </w:tcPr>
+          <w:p>
+            <w:r>
+              <w:t>concorrente</w:t>
+            </w:r>
+          </w:p>
+        </w:tc>
+        <w:tc>
+          <w:tcPr>
+            <w:tcW w:type="dxa" w:w="1728"/>
+          </w:tcPr>
+          <w:p>
+            <w:r>
+              <w:t>5</w:t>
+            </w:r>
+          </w:p>
+        </w:tc>
+        <w:tc>
+          <w:tcPr>
+            <w:tcW w:type="dxa" w:w="1728"/>
+          </w:tcPr>
+          <w:p>
+            <w:r>
+              <w:t>20</w:t>
+            </w:r>
+          </w:p>
+        </w:tc>
+        <w:tc>
+          <w:tcPr>
+            <w:tcW w:type="dxa" w:w="1728"/>
+          </w:tcPr>
+          <w:p>
+            <w:r>
+              <w:t>32.5</w:t>
+            </w:r>
+          </w:p>
+        </w:tc>
+        <w:tc>
+          <w:tcPr>
+            <w:tcW w:type="dxa" w:w="1728"/>
+          </w:tcPr>
+          <w:p>
+            <w:r>
+              <w:t>45</w:t>
+            </w:r>
+          </w:p>
+        </w:tc>
+      </w:tr>
+      <w:tr>
+        <w:tc>
+          <w:tcPr>
+            <w:tcW w:type="dxa" w:w="1728"/>
+          </w:tcPr>
+          <w:p>
+            <w:r>
+              <w:t>concorrente</w:t>
+            </w:r>
+          </w:p>
+        </w:tc>
+        <w:tc>
+          <w:tcPr>
+            <w:tcW w:type="dxa" w:w="1728"/>
+          </w:tcPr>
+          <w:p>
+            <w:r>
+              <w:t>50</w:t>
+            </w:r>
+          </w:p>
+        </w:tc>
+        <w:tc>
+          <w:tcPr>
+            <w:tcW w:type="dxa" w:w="1728"/>
+          </w:tcPr>
+          <w:p>
+            <w:r>
+              <w:t>169</w:t>
+            </w:r>
+          </w:p>
+        </w:tc>
+        <w:tc>
+          <w:tcPr>
+            <w:tcW w:type="dxa" w:w="1728"/>
+          </w:tcPr>
+          <w:p>
+            <w:r>
+              <w:t>182.0</w:t>
+            </w:r>
+          </w:p>
+        </w:tc>
+        <w:tc>
+          <w:tcPr>
+            <w:tcW w:type="dxa" w:w="1728"/>
+          </w:tcPr>
+          <w:p>
+            <w:r>
+              <w:t>195</w:t>
+            </w:r>
+          </w:p>
+        </w:tc>
+      </w:tr>
+      <w:tr>
+        <w:tc>
+          <w:tcPr>
+            <w:tcW w:type="dxa" w:w="1728"/>
+          </w:tcPr>
+          <w:p>
+            <w:r>
+              <w:t>concorrente</w:t>
+            </w:r>
+          </w:p>
+        </w:tc>
+        <w:tc>
+          <w:tcPr>
+            <w:tcW w:type="dxa" w:w="1728"/>
+          </w:tcPr>
+          <w:p>
+            <w:r>
+              <w:t>500</w:t>
+            </w:r>
+          </w:p>
+        </w:tc>
+        <w:tc>
+          <w:tcPr>
+            <w:tcW w:type="dxa" w:w="1728"/>
+          </w:tcPr>
+          <w:p>
+            <w:r>
+              <w:t>1525</w:t>
+            </w:r>
+          </w:p>
+        </w:tc>
+        <w:tc>
+          <w:tcPr>
+            <w:tcW w:type="dxa" w:w="1728"/>
+          </w:tcPr>
+          <w:p>
+            <w:r>
+              <w:t>1769.5</w:t>
+            </w:r>
+          </w:p>
+        </w:tc>
+        <w:tc>
+          <w:tcPr>
+            <w:tcW w:type="dxa" w:w="1728"/>
+          </w:tcPr>
+          <w:p>
+            <w:r>
+              <w:t>2014</w:t>
+            </w:r>
+          </w:p>
+        </w:tc>
+      </w:tr>
+      <w:tr>
+        <w:tc>
+          <w:tcPr>
+            <w:tcW w:type="dxa" w:w="1728"/>
+          </w:tcPr>
+          <w:p>
+            <w:r>
+              <w:t>pool</w:t>
+            </w:r>
+          </w:p>
+        </w:tc>
+        <w:tc>
+          <w:tcPr>
+            <w:tcW w:type="dxa" w:w="1728"/>
+          </w:tcPr>
+          <w:p>
+            <w:r>
+              <w:t>5</w:t>
+            </w:r>
+          </w:p>
+        </w:tc>
+        <w:tc>
+          <w:tcPr>
+            <w:tcW w:type="dxa" w:w="1728"/>
+          </w:tcPr>
+          <w:p>
+            <w:r>
+              <w:t>19</w:t>
+            </w:r>
+          </w:p>
+        </w:tc>
+        <w:tc>
+          <w:tcPr>
+            <w:tcW w:type="dxa" w:w="1728"/>
+          </w:tcPr>
+          <w:p>
+            <w:r>
+              <w:t>26.0</w:t>
+            </w:r>
+          </w:p>
+        </w:tc>
+        <w:tc>
+          <w:tcPr>
+            <w:tcW w:type="dxa" w:w="1728"/>
+          </w:tcPr>
+          <w:p>
+            <w:r>
+              <w:t>33</w:t>
+            </w:r>
+          </w:p>
+        </w:tc>
+      </w:tr>
+      <w:tr>
+        <w:tc>
+          <w:tcPr>
+            <w:tcW w:type="dxa" w:w="1728"/>
+          </w:tcPr>
+          <w:p>
+            <w:r>
+              <w:t>pool</w:t>
+            </w:r>
+          </w:p>
+        </w:tc>
+        <w:tc>
+          <w:tcPr>
+            <w:tcW w:type="dxa" w:w="1728"/>
+          </w:tcPr>
+          <w:p>
+            <w:r>
+              <w:t>50</w:t>
+            </w:r>
+          </w:p>
+        </w:tc>
+        <w:tc>
+          <w:tcPr>
+            <w:tcW w:type="dxa" w:w="1728"/>
+          </w:tcPr>
+          <w:p>
+            <w:r>
+              <w:t>183</w:t>
+            </w:r>
+          </w:p>
+        </w:tc>
+        <w:tc>
+          <w:tcPr>
+            <w:tcW w:type="dxa" w:w="1728"/>
+          </w:tcPr>
+          <w:p>
+            <w:r>
+              <w:t>204.0</w:t>
+            </w:r>
+          </w:p>
+        </w:tc>
+        <w:tc>
+          <w:tcPr>
+            <w:tcW w:type="dxa" w:w="1728"/>
+          </w:tcPr>
+          <w:p>
+            <w:r>
+              <w:t>225</w:t>
+            </w:r>
+          </w:p>
+        </w:tc>
+      </w:tr>
+      <w:tr>
+        <w:tc>
+          <w:tcPr>
+            <w:tcW w:type="dxa" w:w="1728"/>
+          </w:tcPr>
+          <w:p>
+            <w:r>
+              <w:t>pool</w:t>
+            </w:r>
+          </w:p>
+        </w:tc>
+        <w:tc>
+          <w:tcPr>
+            <w:tcW w:type="dxa" w:w="1728"/>
+          </w:tcPr>
+          <w:p>
+            <w:r>
+              <w:t>500</w:t>
+            </w:r>
+          </w:p>
+        </w:tc>
+        <w:tc>
+          <w:tcPr>
+            <w:tcW w:type="dxa" w:w="1728"/>
+          </w:tcPr>
+          <w:p>
+            <w:r>
+              <w:t>1965</w:t>
+            </w:r>
+          </w:p>
+        </w:tc>
+        <w:tc>
+          <w:tcPr>
+            <w:tcW w:type="dxa" w:w="1728"/>
+          </w:tcPr>
+          <w:p>
+            <w:r>
+              <w:t>2176.5</w:t>
+            </w:r>
+          </w:p>
+        </w:tc>
+        <w:tc>
+          <w:tcPr>
+            <w:tcW w:type="dxa" w:w="1728"/>
+          </w:tcPr>
+          <w:p>
+            <w:r>
+              <w:t>2388</w:t>
+            </w:r>
+          </w:p>
+        </w:tc>
+      </w:tr>
+      <w:tr>
+        <w:tc>
+          <w:tcPr>
+            <w:tcW w:type="dxa" w:w="1728"/>
+          </w:tcPr>
+          <w:p>
+            <w:r>
+              <w:t>p2p</w:t>
+            </w:r>
+          </w:p>
+        </w:tc>
+        <w:tc>
+          <w:tcPr>
+            <w:tcW w:type="dxa" w:w="1728"/>
+          </w:tcPr>
+          <w:p>
+            <w:r>
+              <w:t>5</w:t>
+            </w:r>
+          </w:p>
+        </w:tc>
+        <w:tc>
+          <w:tcPr>
+            <w:tcW w:type="dxa" w:w="1728"/>
+          </w:tcPr>
+          <w:p>
+            <w:r>
+              <w:t>312</w:t>
+            </w:r>
+          </w:p>
+        </w:tc>
+        <w:tc>
+          <w:tcPr>
+            <w:tcW w:type="dxa" w:w="1728"/>
+          </w:tcPr>
+          <w:p>
+            <w:r>
+              <w:t>312.0</w:t>
+            </w:r>
+          </w:p>
+        </w:tc>
+        <w:tc>
+          <w:tcPr>
+            <w:tcW w:type="dxa" w:w="1728"/>
+          </w:tcPr>
+          <w:p>
+            <w:r>
+              <w:t>312</w:t>
+            </w:r>
+          </w:p>
+        </w:tc>
+      </w:tr>
+      <w:tr>
+        <w:tc>
+          <w:tcPr>
+            <w:tcW w:type="dxa" w:w="1728"/>
+          </w:tcPr>
+          <w:p>
+            <w:r>
+              <w:t>p2p</w:t>
+            </w:r>
+          </w:p>
+        </w:tc>
+        <w:tc>
+          <w:tcPr>
+            <w:tcW w:type="dxa" w:w="1728"/>
+          </w:tcPr>
+          <w:p>
+            <w:r>
+              <w:t>50</w:t>
+            </w:r>
+          </w:p>
+        </w:tc>
+        <w:tc>
+          <w:tcPr>
+            <w:tcW w:type="dxa" w:w="1728"/>
+          </w:tcPr>
+          <w:p>
+            <w:r>
+              <w:t>376</w:t>
+            </w:r>
+          </w:p>
+        </w:tc>
+        <w:tc>
+          <w:tcPr>
+            <w:tcW w:type="dxa" w:w="1728"/>
+          </w:tcPr>
+          <w:p>
+            <w:r>
+              <w:t>376.5</w:t>
+            </w:r>
+          </w:p>
+        </w:tc>
+        <w:tc>
+          <w:tcPr>
+            <w:tcW w:type="dxa" w:w="1728"/>
+          </w:tcPr>
+          <w:p>
+            <w:r>
+              <w:t>377</w:t>
+            </w:r>
+          </w:p>
+        </w:tc>
+      </w:tr>
+      <w:tr>
+        <w:tc>
+          <w:tcPr>
+            <w:tcW w:type="dxa" w:w="1728"/>
+          </w:tcPr>
+          <w:p>
+            <w:r>
+              <w:t>p2p</w:t>
+            </w:r>
+          </w:p>
+        </w:tc>
+        <w:tc>
+          <w:tcPr>
+            <w:tcW w:type="dxa" w:w="1728"/>
+          </w:tcPr>
+          <w:p>
+            <w:r>
+              <w:t>500</w:t>
+            </w:r>
+          </w:p>
+        </w:tc>
+        <w:tc>
+          <w:tcPr>
+            <w:tcW w:type="dxa" w:w="1728"/>
+          </w:tcPr>
+          <w:p>
+            <w:r>
+              <w:t>1343</w:t>
+            </w:r>
+          </w:p>
+        </w:tc>
+        <w:tc>
+          <w:tcPr>
+            <w:tcW w:type="dxa" w:w="1728"/>
+          </w:tcPr>
+          <w:p>
+            <w:r>
+              <w:t>1359.0</w:t>
+            </w:r>
+          </w:p>
+        </w:tc>
+        <w:tc>
+          <w:tcPr>
+            <w:tcW w:type="dxa" w:w="1728"/>
+          </w:tcPr>
+          <w:p>
+            <w:r>
+              <w:t>1375</w:t>
+            </w:r>
+          </w:p>
+        </w:tc>
+      </w:tr>
+    </w:tbl>
+    <w:p/>
+    <w:p>
+      <w:pPr>
+        <w:pStyle w:val="Heading1"/>
+      </w:pPr>
+      <w:r>
+        <w:t>Observações sobre os resultados</w:t>
+      </w:r>
+    </w:p>
+    <w:p>
+      <w:pPr>
+        <w:pStyle w:val="ListBullet"/>
+      </w:pPr>
+      <w:r>
+        <w:t>Com apenas 2 clientes por teste, serial/concorrente/pool apresentam tempos próximos: a vantagem do paralelismo (concorrente/pool) sobre o serial só fica evidente com mais clientes simultâneos disputando o servidor (com 2 clientes e pool N=2, o pool se comporta igual ao concorrente, como esperado e já observado nos testes unitários).</w:t>
+      </w:r>
+    </w:p>
+    <w:p>
+      <w:pPr>
+        <w:pStyle w:val="ListBullet"/>
+      </w:pPr>
+      <w:r>
+        <w:t>O P2P tem um custo fixo de inicialização (handshake de protocolo, descoberta de peer) que domina o tempo em arquivos pequenos (312ms para 5MB, mais lento que as demais arquiteturas nesse tamanho). Em arquivos maiores esse custo fixo se dilui: 500MB em P2P (1359ms média) foi mais rápido que serial (2078ms) e pool (2176ms), e competitivo com concorrente (1769ms), mesmo rodando como dois peers locais sem benefício real de distribuição de carga de upload.</w:t>
+      </w:r>
+    </w:p>
+    <w:p>
+      <w:pPr>
+        <w:pStyle w:val="ListBullet"/>
+      </w:pPr>
+      <w:r>
+        <w:t>Todos os experimentos rodaram em localhost (mesma máquina), portanto os tempos refletem overhead de protocolo e processamento, não latência de rede real.</w:t>
+      </w:r>
+    </w:p>
+    <w:p>
+      <w:pPr>
+        <w:pStyle w:val="Heading1"/>
+      </w:pPr>
+      <w:r>
+        <w:t>Dados brutos</w:t>
+      </w:r>
+    </w:p>
+    <w:p>
+      <w:r>
+        <w:t>CSV completo (24 linhas: 4 arquiteturas x 3 tamanhos x 2 clientes) disponível em p2p_src/resultados_experimento_final.csv, gerado pelo script rodar_experimentos.sh e agregado por agregar.ts.</w:t>
+      </w:r>
+    </w:p>
     <w:sectPr>
       <w:pgSz w:w="12240" w:h="15840"/>
       <w:pgMar w:top="1440" w:right="1800" w:bottom="1440" w:left="1800" w:header="720" w:footer="720" w:gutter="0"/>

</xml_diff>

<commit_message>
docs: revisa texto do docx (corrige observacao P2P 500MB, estrutura de pastas, autor)
</commit_message>
<xml_diff>
--- a/Diagramas de Arquitetura - Atividade 01 P2P.docx
+++ b/Diagramas de Arquitetura - Atividade 01 P2P.docx
@@ -17,6 +17,14 @@
       </w:pPr>
       <w:r>
         <w:t>Atividade 01 - Unidade 2 - Sistemas Distribuídos</w:t>
+      </w:r>
+    </w:p>
+    <w:p>
+      <w:pPr>
+        <w:jc w:val="center"/>
+      </w:pPr>
+      <w:r>
+        <w:t>Ysrael de Jesus Sacramento</w:t>
       </w:r>
     </w:p>
     <w:p>
@@ -95,7 +103,7 @@
     </w:p>
     <w:p>
       <w:r>
-        <w:t>O servidor cria uma thread dedicada para cada cliente que se conecta, permitindo que todos os downloads ocorram em paralelo. O tempo total se aproxima do tempo de um único download, limitado pela largura de banda disponível no servidor. Desvantagem: consumo de memória cresce com o número de clientes simultâneos.</w:t>
+        <w:t>O servidor atende todos os clientes conectados ao mesmo tempo, sem fila. No modelo clássico (Java/Python), isso é implementado com uma thread dedicada por cliente; na implementação em Node.js desta atividade (ver seção de Decisões de Implementação) o mesmo efeito é obtido nativamente via event loop assíncrono, sem threads reais. O tempo total se aproxima do tempo de um único download, limitado pela largura de banda disponível no servidor.</w:t>
       </w:r>
     </w:p>
     <w:p>
@@ -333,23 +341,31 @@
         <w:rPr>
           <w:rFonts w:ascii="Consolas" w:hAnsi="Consolas"/>
         </w:rPr>
-        <w:t>p2p/</w:t>
+        <w:t>p2p/                          (raiz do repositorio git)</w:t>
         <w:br/>
-        <w:t xml:space="preserve">  app/</w:t>
+        <w:t xml:space="preserve">  p2p_src/                    (codigo-fonte Node + TypeScript)</w:t>
         <w:br/>
         <w:t xml:space="preserve">    src/</w:t>
         <w:br/>
-        <w:t xml:space="preserve">      common/        gerarArquivo.ts, csv.ts</w:t>
+        <w:t xml:space="preserve">      common/      gerarArquivo.ts, csv.ts (+ .test.ts de cada um)</w:t>
         <w:br/>
-        <w:t xml:space="preserve">      serial/         server.ts, client.ts</w:t>
+        <w:t xml:space="preserve">      serial/      server.ts, client.ts, fila.test.ts</w:t>
         <w:br/>
-        <w:t xml:space="preserve">      concorrente/     server.ts, client.ts   (equivalente a "threads")</w:t>
+        <w:t xml:space="preserve">      concorrente/ server.ts, client.ts   (equivalente a "threads")</w:t>
         <w:br/>
-        <w:t xml:space="preserve">      pool/            server.ts, client.ts</w:t>
+        <w:t xml:space="preserve">      pool/        server.ts, client.ts, fila.test.ts</w:t>
         <w:br/>
-        <w:t xml:space="preserve">      p2p/             seed.ts, peer.ts</w:t>
+        <w:t xml:space="preserve">      p2p/         seed.ts, peer.ts, webtorrent.api.test.ts</w:t>
         <w:br/>
-        <w:t xml:space="preserve">    resultados.csv</w:t>
+        <w:t xml:space="preserve">      agregar.ts</w:t>
+        <w:br/>
+        <w:t xml:space="preserve">    rodar_experimentos.sh</w:t>
+        <w:br/>
+        <w:t xml:space="preserve">    resultados.csv / resultados_experimento_final.csv</w:t>
+        <w:br/>
+        <w:t xml:space="preserve">  diagrams/                   (arquivos .puml e .png)</w:t>
+        <w:br/>
+        <w:t xml:space="preserve">  DECISOES.md</w:t>
       </w:r>
     </w:p>
     <w:p>
@@ -1337,7 +1353,7 @@
         <w:pStyle w:val="ListBullet"/>
       </w:pPr>
       <w:r>
-        <w:t>O P2P tem um custo fixo de inicialização (handshake de protocolo, descoberta de peer) que domina o tempo em arquivos pequenos (312ms para 5MB, mais lento que as demais arquiteturas nesse tamanho). Em arquivos maiores esse custo fixo se dilui: 500MB em P2P (1359ms média) foi mais rápido que serial (2078ms) e pool (2176ms), e competitivo com concorrente (1769ms), mesmo rodando como dois peers locais sem benefício real de distribuição de carga de upload.</w:t>
+        <w:t>O P2P tem um custo fixo de inicialização (handshake de protocolo, descoberta de peer) que domina o tempo em arquivos pequenos: foi a arquitetura mais lenta em 5MB (312ms de média, contra 26-33ms das demais). Em arquivos maiores esse custo fixo se dilui e a transferência em si passa a dominar: em 500MB o P2P foi a arquitetura MAIS RÁPIDA das quatro (1359ms de média), superando concorrente (1769ms), serial (2078ms) e pool (2176ms) — mesmo rodando como dois peers locais, sem o benefício real de uma rede com muitos peers distribuindo upload entre si.</w:t>
       </w:r>
     </w:p>
     <w:p>

</xml_diff>